<commit_message>
Prepare latest Scientific Reports release v0.1.6
</commit_message>
<xml_diff>
--- a/manuscript/submission/table_1_dataset_summary.docx
+++ b/manuscript/submission/table_1_dataset_summary.docx
@@ -4,10 +4,14 @@
   <w:body>
     <w:p>
       <w:pPr>
-        <w:pStyle w:val="Title"/>
-        <w:spacing w:after="200"/>
+        <w:jc w:val="center"/>
       </w:pPr>
       <w:r>
+        <w:rPr>
+          <w:rFonts w:ascii="Times New Roman" w:hAnsi="Times New Roman"/>
+          <w:b/>
+          <w:sz w:val="22"/>
+        </w:rPr>
         <w:t>Table 1. Dataset summary</w:t>
       </w:r>
     </w:p>
@@ -31,21 +35,24 @@
         <w:gridCol w:w="1454"/>
       </w:tblGrid>
       <w:tr>
+        <w:trPr>
+          <w:tblHeader w:val="true"/>
+        </w:trPr>
         <w:tc>
           <w:tcPr>
-            <w:tcW w:type="dxa" w:w="1224"/>
+            <w:tcW w:type="dxa" w:w="1454"/>
             <w:vAlign w:val="center"/>
             <w:shd w:fill="D9EAF7"/>
           </w:tcPr>
           <w:p>
             <w:pPr>
-              <w:spacing w:after="0"/>
+              <w:jc w:val="left"/>
             </w:pPr>
             <w:r>
               <w:rPr>
                 <w:rFonts w:ascii="Times New Roman" w:hAnsi="Times New Roman"/>
                 <w:b/>
-                <w:sz w:val="14"/>
+                <w:sz w:val="12"/>
               </w:rPr>
               <w:t>dataset</w:t>
             </w:r>
@@ -53,19 +60,19 @@
         </w:tc>
         <w:tc>
           <w:tcPr>
-            <w:tcW w:type="dxa" w:w="1224"/>
+            <w:tcW w:type="dxa" w:w="1454"/>
             <w:vAlign w:val="center"/>
             <w:shd w:fill="D9EAF7"/>
           </w:tcPr>
           <w:p>
             <w:pPr>
-              <w:spacing w:after="0"/>
+              <w:jc w:val="left"/>
             </w:pPr>
             <w:r>
               <w:rPr>
                 <w:rFonts w:ascii="Times New Roman" w:hAnsi="Times New Roman"/>
                 <w:b/>
-                <w:sz w:val="14"/>
+                <w:sz w:val="12"/>
               </w:rPr>
               <w:t>scene</w:t>
             </w:r>
@@ -73,19 +80,19 @@
         </w:tc>
         <w:tc>
           <w:tcPr>
-            <w:tcW w:type="dxa" w:w="936"/>
+            <w:tcW w:type="dxa" w:w="1454"/>
             <w:vAlign w:val="center"/>
             <w:shd w:fill="D9EAF7"/>
           </w:tcPr>
           <w:p>
             <w:pPr>
-              <w:spacing w:after="0"/>
+              <w:jc w:val="left"/>
             </w:pPr>
             <w:r>
               <w:rPr>
                 <w:rFonts w:ascii="Times New Roman" w:hAnsi="Times New Roman"/>
                 <w:b/>
-                <w:sz w:val="14"/>
+                <w:sz w:val="12"/>
               </w:rPr>
               <w:t>image_count</w:t>
             </w:r>
@@ -93,19 +100,19 @@
         </w:tc>
         <w:tc>
           <w:tcPr>
-            <w:tcW w:type="dxa" w:w="1080"/>
+            <w:tcW w:type="dxa" w:w="1454"/>
             <w:vAlign w:val="center"/>
             <w:shd w:fill="D9EAF7"/>
           </w:tcPr>
           <w:p>
             <w:pPr>
-              <w:spacing w:after="0"/>
+              <w:jc w:val="left"/>
             </w:pPr>
             <w:r>
               <w:rPr>
                 <w:rFonts w:ascii="Times New Roman" w:hAnsi="Times New Roman"/>
                 <w:b/>
-                <w:sz w:val="14"/>
+                <w:sz w:val="12"/>
               </w:rPr>
               <w:t>held_out_test_views</w:t>
             </w:r>
@@ -113,19 +120,19 @@
         </w:tc>
         <w:tc>
           <w:tcPr>
-            <w:tcW w:type="dxa" w:w="864"/>
+            <w:tcW w:type="dxa" w:w="1454"/>
             <w:vAlign w:val="center"/>
             <w:shd w:fill="D9EAF7"/>
           </w:tcPr>
           <w:p>
             <w:pPr>
-              <w:spacing w:after="0"/>
+              <w:jc w:val="left"/>
             </w:pPr>
             <w:r>
               <w:rPr>
                 <w:rFonts w:ascii="Times New Roman" w:hAnsi="Times New Roman"/>
                 <w:b/>
-                <w:sz w:val="14"/>
+                <w:sz w:val="12"/>
               </w:rPr>
               <w:t>split_count</w:t>
             </w:r>
@@ -133,19 +140,19 @@
         </w:tc>
         <w:tc>
           <w:tcPr>
-            <w:tcW w:type="dxa" w:w="1224"/>
+            <w:tcW w:type="dxa" w:w="1454"/>
             <w:vAlign w:val="center"/>
             <w:shd w:fill="D9EAF7"/>
           </w:tcPr>
           <w:p>
             <w:pPr>
-              <w:spacing w:after="0"/>
+              <w:jc w:val="left"/>
             </w:pPr>
             <w:r>
               <w:rPr>
                 <w:rFonts w:ascii="Times New Roman" w:hAnsi="Times New Roman"/>
                 <w:b/>
-                <w:sz w:val="14"/>
+                <w:sz w:val="12"/>
               </w:rPr>
               <w:t>dataset_status</w:t>
             </w:r>
@@ -153,19 +160,19 @@
         </w:tc>
         <w:tc>
           <w:tcPr>
-            <w:tcW w:type="dxa" w:w="1296"/>
+            <w:tcW w:type="dxa" w:w="1454"/>
             <w:vAlign w:val="center"/>
             <w:shd w:fill="D9EAF7"/>
           </w:tcPr>
           <w:p>
             <w:pPr>
-              <w:spacing w:after="0"/>
+              <w:jc w:val="left"/>
             </w:pPr>
             <w:r>
               <w:rPr>
                 <w:rFonts w:ascii="Times New Roman" w:hAnsi="Times New Roman"/>
                 <w:b/>
-                <w:sz w:val="14"/>
+                <w:sz w:val="12"/>
               </w:rPr>
               <w:t>redistribution_status</w:t>
             </w:r>
@@ -173,19 +180,19 @@
         </w:tc>
         <w:tc>
           <w:tcPr>
-            <w:tcW w:type="dxa" w:w="1224"/>
+            <w:tcW w:type="dxa" w:w="1454"/>
             <w:vAlign w:val="center"/>
             <w:shd w:fill="D9EAF7"/>
           </w:tcPr>
           <w:p>
             <w:pPr>
-              <w:spacing w:after="0"/>
+              <w:jc w:val="left"/>
             </w:pPr>
             <w:r>
               <w:rPr>
                 <w:rFonts w:ascii="Times New Roman" w:hAnsi="Times New Roman"/>
                 <w:b/>
-                <w:sz w:val="14"/>
+                <w:sz w:val="12"/>
               </w:rPr>
               <w:t>raw_images_included</w:t>
             </w:r>
@@ -193,19 +200,19 @@
         </w:tc>
         <w:tc>
           <w:tcPr>
-            <w:tcW w:type="dxa" w:w="864"/>
+            <w:tcW w:type="dxa" w:w="1454"/>
             <w:vAlign w:val="center"/>
             <w:shd w:fill="D9EAF7"/>
           </w:tcPr>
           <w:p>
             <w:pPr>
-              <w:spacing w:after="0"/>
+              <w:jc w:val="left"/>
             </w:pPr>
             <w:r>
               <w:rPr>
                 <w:rFonts w:ascii="Times New Roman" w:hAnsi="Times New Roman"/>
                 <w:b/>
-                <w:sz w:val="14"/>
+                <w:sz w:val="12"/>
               </w:rPr>
               <w:t>citation_required</w:t>
             </w:r>
@@ -213,19 +220,19 @@
         </w:tc>
         <w:tc>
           <w:tcPr>
-            <w:tcW w:type="dxa" w:w="3024"/>
+            <w:tcW w:type="dxa" w:w="1454"/>
             <w:vAlign w:val="center"/>
             <w:shd w:fill="D9EAF7"/>
           </w:tcPr>
           <w:p>
             <w:pPr>
-              <w:spacing w:after="0"/>
+              <w:jc w:val="left"/>
             </w:pPr>
             <w:r>
               <w:rPr>
                 <w:rFonts w:ascii="Times New Roman" w:hAnsi="Times New Roman"/>
                 <w:b/>
-                <w:sz w:val="14"/>
+                <w:sz w:val="12"/>
               </w:rPr>
               <w:t>license_notes</w:t>
             </w:r>
@@ -235,17 +242,17 @@
       <w:tr>
         <w:tc>
           <w:tcPr>
-            <w:tcW w:type="dxa" w:w="1224"/>
+            <w:tcW w:type="dxa" w:w="1454"/>
             <w:vAlign w:val="center"/>
           </w:tcPr>
           <w:p>
             <w:pPr>
-              <w:spacing w:after="0"/>
+              <w:jc w:val="left"/>
             </w:pPr>
             <w:r>
               <w:rPr>
                 <w:rFonts w:ascii="Times New Roman" w:hAnsi="Times New Roman"/>
-                <w:sz w:val="14"/>
+                <w:sz w:val="12"/>
               </w:rPr>
               <w:t>Tanks and Temples</w:t>
             </w:r>
@@ -253,17 +260,17 @@
         </w:tc>
         <w:tc>
           <w:tcPr>
-            <w:tcW w:type="dxa" w:w="1224"/>
+            <w:tcW w:type="dxa" w:w="1454"/>
             <w:vAlign w:val="center"/>
           </w:tcPr>
           <w:p>
             <w:pPr>
-              <w:spacing w:after="0"/>
+              <w:jc w:val="left"/>
             </w:pPr>
             <w:r>
               <w:rPr>
                 <w:rFonts w:ascii="Times New Roman" w:hAnsi="Times New Roman"/>
-                <w:sz w:val="14"/>
+                <w:sz w:val="12"/>
               </w:rPr>
               <w:t>tandt/train</w:t>
             </w:r>
@@ -271,17 +278,17 @@
         </w:tc>
         <w:tc>
           <w:tcPr>
-            <w:tcW w:type="dxa" w:w="936"/>
+            <w:tcW w:type="dxa" w:w="1454"/>
             <w:vAlign w:val="center"/>
           </w:tcPr>
           <w:p>
             <w:pPr>
-              <w:spacing w:after="0"/>
+              <w:jc w:val="left"/>
             </w:pPr>
             <w:r>
               <w:rPr>
                 <w:rFonts w:ascii="Times New Roman" w:hAnsi="Times New Roman"/>
-                <w:sz w:val="14"/>
+                <w:sz w:val="12"/>
               </w:rPr>
               <w:t>301</w:t>
             </w:r>
@@ -289,17 +296,17 @@
         </w:tc>
         <w:tc>
           <w:tcPr>
-            <w:tcW w:type="dxa" w:w="1080"/>
+            <w:tcW w:type="dxa" w:w="1454"/>
             <w:vAlign w:val="center"/>
           </w:tcPr>
           <w:p>
             <w:pPr>
-              <w:spacing w:after="0"/>
+              <w:jc w:val="left"/>
             </w:pPr>
             <w:r>
               <w:rPr>
                 <w:rFonts w:ascii="Times New Roman" w:hAnsi="Times New Roman"/>
-                <w:sz w:val="14"/>
+                <w:sz w:val="12"/>
               </w:rPr>
               <w:t>20</w:t>
             </w:r>
@@ -307,17 +314,17 @@
         </w:tc>
         <w:tc>
           <w:tcPr>
-            <w:tcW w:type="dxa" w:w="864"/>
+            <w:tcW w:type="dxa" w:w="1454"/>
             <w:vAlign w:val="center"/>
           </w:tcPr>
           <w:p>
             <w:pPr>
-              <w:spacing w:after="0"/>
+              <w:jc w:val="left"/>
             </w:pPr>
             <w:r>
               <w:rPr>
                 <w:rFonts w:ascii="Times New Roman" w:hAnsi="Times New Roman"/>
-                <w:sz w:val="14"/>
+                <w:sz w:val="12"/>
               </w:rPr>
               <w:t>60</w:t>
             </w:r>
@@ -325,17 +332,17 @@
         </w:tc>
         <w:tc>
           <w:tcPr>
-            <w:tcW w:type="dxa" w:w="1224"/>
+            <w:tcW w:type="dxa" w:w="1454"/>
             <w:vAlign w:val="center"/>
           </w:tcPr>
           <w:p>
             <w:pPr>
-              <w:spacing w:after="0"/>
+              <w:jc w:val="left"/>
             </w:pPr>
             <w:r>
               <w:rPr>
                 <w:rFonts w:ascii="Times New Roman" w:hAnsi="Times New Roman"/>
-                <w:sz w:val="14"/>
+                <w:sz w:val="12"/>
               </w:rPr>
               <w:t>public dataset</w:t>
             </w:r>
@@ -343,17 +350,17 @@
         </w:tc>
         <w:tc>
           <w:tcPr>
-            <w:tcW w:type="dxa" w:w="1296"/>
+            <w:tcW w:type="dxa" w:w="1454"/>
             <w:vAlign w:val="center"/>
           </w:tcPr>
           <w:p>
             <w:pPr>
-              <w:spacing w:after="0"/>
+              <w:jc w:val="left"/>
             </w:pPr>
             <w:r>
               <w:rPr>
                 <w:rFonts w:ascii="Times New Roman" w:hAnsi="Times New Roman"/>
-                <w:sz w:val="14"/>
+                <w:sz w:val="12"/>
               </w:rPr>
               <w:t>MANUAL CHECK REQUIRED</w:t>
             </w:r>
@@ -361,17 +368,17 @@
         </w:tc>
         <w:tc>
           <w:tcPr>
-            <w:tcW w:type="dxa" w:w="1224"/>
+            <w:tcW w:type="dxa" w:w="1454"/>
             <w:vAlign w:val="center"/>
           </w:tcPr>
           <w:p>
             <w:pPr>
-              <w:spacing w:after="0"/>
+              <w:jc w:val="left"/>
             </w:pPr>
             <w:r>
               <w:rPr>
                 <w:rFonts w:ascii="Times New Roman" w:hAnsi="Times New Roman"/>
-                <w:sz w:val="14"/>
+                <w:sz w:val="12"/>
               </w:rPr>
               <w:t>not included in lightweight package</w:t>
             </w:r>
@@ -379,17 +386,17 @@
         </w:tc>
         <w:tc>
           <w:tcPr>
-            <w:tcW w:type="dxa" w:w="864"/>
+            <w:tcW w:type="dxa" w:w="1454"/>
             <w:vAlign w:val="center"/>
           </w:tcPr>
           <w:p>
             <w:pPr>
-              <w:spacing w:after="0"/>
+              <w:jc w:val="left"/>
             </w:pPr>
             <w:r>
               <w:rPr>
                 <w:rFonts w:ascii="Times New Roman" w:hAnsi="Times New Roman"/>
-                <w:sz w:val="14"/>
+                <w:sz w:val="12"/>
               </w:rPr>
               <w:t>yes</w:t>
             </w:r>
@@ -397,17 +404,17 @@
         </w:tc>
         <w:tc>
           <w:tcPr>
-            <w:tcW w:type="dxa" w:w="3024"/>
+            <w:tcW w:type="dxa" w:w="1454"/>
             <w:vAlign w:val="center"/>
           </w:tcPr>
           <w:p>
             <w:pPr>
-              <w:spacing w:after="0"/>
+              <w:jc w:val="left"/>
             </w:pPr>
             <w:r>
               <w:rPr>
                 <w:rFonts w:ascii="Times New Roman" w:hAnsi="Times New Roman"/>
-                <w:sz w:val="14"/>
+                <w:sz w:val="12"/>
               </w:rPr>
               <w:t>Use dataset-specific terms and cite Tanks and Temples; verify license page before public redistribution.</w:t>
             </w:r>
@@ -417,17 +424,17 @@
       <w:tr>
         <w:tc>
           <w:tcPr>
-            <w:tcW w:type="dxa" w:w="1224"/>
+            <w:tcW w:type="dxa" w:w="1454"/>
             <w:vAlign w:val="center"/>
           </w:tcPr>
           <w:p>
             <w:pPr>
-              <w:spacing w:after="0"/>
+              <w:jc w:val="left"/>
             </w:pPr>
             <w:r>
               <w:rPr>
                 <w:rFonts w:ascii="Times New Roman" w:hAnsi="Times New Roman"/>
-                <w:sz w:val="14"/>
+                <w:sz w:val="12"/>
               </w:rPr>
               <w:t>Tanks and Temples</w:t>
             </w:r>
@@ -435,17 +442,17 @@
         </w:tc>
         <w:tc>
           <w:tcPr>
-            <w:tcW w:type="dxa" w:w="1224"/>
+            <w:tcW w:type="dxa" w:w="1454"/>
             <w:vAlign w:val="center"/>
           </w:tcPr>
           <w:p>
             <w:pPr>
-              <w:spacing w:after="0"/>
+              <w:jc w:val="left"/>
             </w:pPr>
             <w:r>
               <w:rPr>
                 <w:rFonts w:ascii="Times New Roman" w:hAnsi="Times New Roman"/>
-                <w:sz w:val="14"/>
+                <w:sz w:val="12"/>
               </w:rPr>
               <w:t>tandt/truck</w:t>
             </w:r>
@@ -453,17 +460,17 @@
         </w:tc>
         <w:tc>
           <w:tcPr>
-            <w:tcW w:type="dxa" w:w="936"/>
+            <w:tcW w:type="dxa" w:w="1454"/>
             <w:vAlign w:val="center"/>
           </w:tcPr>
           <w:p>
             <w:pPr>
-              <w:spacing w:after="0"/>
+              <w:jc w:val="left"/>
             </w:pPr>
             <w:r>
               <w:rPr>
                 <w:rFonts w:ascii="Times New Roman" w:hAnsi="Times New Roman"/>
-                <w:sz w:val="14"/>
+                <w:sz w:val="12"/>
               </w:rPr>
               <w:t>251</w:t>
             </w:r>
@@ -471,17 +478,17 @@
         </w:tc>
         <w:tc>
           <w:tcPr>
-            <w:tcW w:type="dxa" w:w="1080"/>
+            <w:tcW w:type="dxa" w:w="1454"/>
             <w:vAlign w:val="center"/>
           </w:tcPr>
           <w:p>
             <w:pPr>
-              <w:spacing w:after="0"/>
+              <w:jc w:val="left"/>
             </w:pPr>
             <w:r>
               <w:rPr>
                 <w:rFonts w:ascii="Times New Roman" w:hAnsi="Times New Roman"/>
-                <w:sz w:val="14"/>
+                <w:sz w:val="12"/>
               </w:rPr>
               <w:t>20</w:t>
             </w:r>
@@ -489,17 +496,17 @@
         </w:tc>
         <w:tc>
           <w:tcPr>
-            <w:tcW w:type="dxa" w:w="864"/>
+            <w:tcW w:type="dxa" w:w="1454"/>
             <w:vAlign w:val="center"/>
           </w:tcPr>
           <w:p>
             <w:pPr>
-              <w:spacing w:after="0"/>
+              <w:jc w:val="left"/>
             </w:pPr>
             <w:r>
               <w:rPr>
                 <w:rFonts w:ascii="Times New Roman" w:hAnsi="Times New Roman"/>
-                <w:sz w:val="14"/>
+                <w:sz w:val="12"/>
               </w:rPr>
               <w:t>60</w:t>
             </w:r>
@@ -507,17 +514,17 @@
         </w:tc>
         <w:tc>
           <w:tcPr>
-            <w:tcW w:type="dxa" w:w="1224"/>
+            <w:tcW w:type="dxa" w:w="1454"/>
             <w:vAlign w:val="center"/>
           </w:tcPr>
           <w:p>
             <w:pPr>
-              <w:spacing w:after="0"/>
+              <w:jc w:val="left"/>
             </w:pPr>
             <w:r>
               <w:rPr>
                 <w:rFonts w:ascii="Times New Roman" w:hAnsi="Times New Roman"/>
-                <w:sz w:val="14"/>
+                <w:sz w:val="12"/>
               </w:rPr>
               <w:t>public dataset</w:t>
             </w:r>
@@ -525,17 +532,17 @@
         </w:tc>
         <w:tc>
           <w:tcPr>
-            <w:tcW w:type="dxa" w:w="1296"/>
+            <w:tcW w:type="dxa" w:w="1454"/>
             <w:vAlign w:val="center"/>
           </w:tcPr>
           <w:p>
             <w:pPr>
-              <w:spacing w:after="0"/>
+              <w:jc w:val="left"/>
             </w:pPr>
             <w:r>
               <w:rPr>
                 <w:rFonts w:ascii="Times New Roman" w:hAnsi="Times New Roman"/>
-                <w:sz w:val="14"/>
+                <w:sz w:val="12"/>
               </w:rPr>
               <w:t>MANUAL CHECK REQUIRED</w:t>
             </w:r>
@@ -543,17 +550,17 @@
         </w:tc>
         <w:tc>
           <w:tcPr>
-            <w:tcW w:type="dxa" w:w="1224"/>
+            <w:tcW w:type="dxa" w:w="1454"/>
             <w:vAlign w:val="center"/>
           </w:tcPr>
           <w:p>
             <w:pPr>
-              <w:spacing w:after="0"/>
+              <w:jc w:val="left"/>
             </w:pPr>
             <w:r>
               <w:rPr>
                 <w:rFonts w:ascii="Times New Roman" w:hAnsi="Times New Roman"/>
-                <w:sz w:val="14"/>
+                <w:sz w:val="12"/>
               </w:rPr>
               <w:t>not included in lightweight package</w:t>
             </w:r>
@@ -561,17 +568,17 @@
         </w:tc>
         <w:tc>
           <w:tcPr>
-            <w:tcW w:type="dxa" w:w="864"/>
+            <w:tcW w:type="dxa" w:w="1454"/>
             <w:vAlign w:val="center"/>
           </w:tcPr>
           <w:p>
             <w:pPr>
-              <w:spacing w:after="0"/>
+              <w:jc w:val="left"/>
             </w:pPr>
             <w:r>
               <w:rPr>
                 <w:rFonts w:ascii="Times New Roman" w:hAnsi="Times New Roman"/>
-                <w:sz w:val="14"/>
+                <w:sz w:val="12"/>
               </w:rPr>
               <w:t>yes</w:t>
             </w:r>
@@ -579,17 +586,17 @@
         </w:tc>
         <w:tc>
           <w:tcPr>
-            <w:tcW w:type="dxa" w:w="3024"/>
+            <w:tcW w:type="dxa" w:w="1454"/>
             <w:vAlign w:val="center"/>
           </w:tcPr>
           <w:p>
             <w:pPr>
-              <w:spacing w:after="0"/>
+              <w:jc w:val="left"/>
             </w:pPr>
             <w:r>
               <w:rPr>
                 <w:rFonts w:ascii="Times New Roman" w:hAnsi="Times New Roman"/>
-                <w:sz w:val="14"/>
+                <w:sz w:val="12"/>
               </w:rPr>
               <w:t>Use dataset-specific terms and cite Tanks and Temples; verify license page before public redistribution.</w:t>
             </w:r>
@@ -599,17 +606,17 @@
       <w:tr>
         <w:tc>
           <w:tcPr>
-            <w:tcW w:type="dxa" w:w="1224"/>
+            <w:tcW w:type="dxa" w:w="1454"/>
             <w:vAlign w:val="center"/>
           </w:tcPr>
           <w:p>
             <w:pPr>
-              <w:spacing w:after="0"/>
+              <w:jc w:val="left"/>
             </w:pPr>
             <w:r>
               <w:rPr>
                 <w:rFonts w:ascii="Times New Roman" w:hAnsi="Times New Roman"/>
-                <w:sz w:val="14"/>
+                <w:sz w:val="12"/>
               </w:rPr>
               <w:t>Deep Blending</w:t>
             </w:r>
@@ -617,17 +624,17 @@
         </w:tc>
         <w:tc>
           <w:tcPr>
-            <w:tcW w:type="dxa" w:w="1224"/>
+            <w:tcW w:type="dxa" w:w="1454"/>
             <w:vAlign w:val="center"/>
           </w:tcPr>
           <w:p>
             <w:pPr>
-              <w:spacing w:after="0"/>
+              <w:jc w:val="left"/>
             </w:pPr>
             <w:r>
               <w:rPr>
                 <w:rFonts w:ascii="Times New Roman" w:hAnsi="Times New Roman"/>
-                <w:sz w:val="14"/>
+                <w:sz w:val="12"/>
               </w:rPr>
               <w:t>db/drjohnson</w:t>
             </w:r>
@@ -635,17 +642,17 @@
         </w:tc>
         <w:tc>
           <w:tcPr>
-            <w:tcW w:type="dxa" w:w="936"/>
+            <w:tcW w:type="dxa" w:w="1454"/>
             <w:vAlign w:val="center"/>
           </w:tcPr>
           <w:p>
             <w:pPr>
-              <w:spacing w:after="0"/>
+              <w:jc w:val="left"/>
             </w:pPr>
             <w:r>
               <w:rPr>
                 <w:rFonts w:ascii="Times New Roman" w:hAnsi="Times New Roman"/>
-                <w:sz w:val="14"/>
+                <w:sz w:val="12"/>
               </w:rPr>
               <w:t>263</w:t>
             </w:r>
@@ -653,17 +660,17 @@
         </w:tc>
         <w:tc>
           <w:tcPr>
-            <w:tcW w:type="dxa" w:w="1080"/>
+            <w:tcW w:type="dxa" w:w="1454"/>
             <w:vAlign w:val="center"/>
           </w:tcPr>
           <w:p>
             <w:pPr>
-              <w:spacing w:after="0"/>
+              <w:jc w:val="left"/>
             </w:pPr>
             <w:r>
               <w:rPr>
                 <w:rFonts w:ascii="Times New Roman" w:hAnsi="Times New Roman"/>
-                <w:sz w:val="14"/>
+                <w:sz w:val="12"/>
               </w:rPr>
               <w:t>20</w:t>
             </w:r>
@@ -671,17 +678,17 @@
         </w:tc>
         <w:tc>
           <w:tcPr>
-            <w:tcW w:type="dxa" w:w="864"/>
+            <w:tcW w:type="dxa" w:w="1454"/>
             <w:vAlign w:val="center"/>
           </w:tcPr>
           <w:p>
             <w:pPr>
-              <w:spacing w:after="0"/>
+              <w:jc w:val="left"/>
             </w:pPr>
             <w:r>
               <w:rPr>
                 <w:rFonts w:ascii="Times New Roman" w:hAnsi="Times New Roman"/>
-                <w:sz w:val="14"/>
+                <w:sz w:val="12"/>
               </w:rPr>
               <w:t>60</w:t>
             </w:r>
@@ -689,17 +696,17 @@
         </w:tc>
         <w:tc>
           <w:tcPr>
-            <w:tcW w:type="dxa" w:w="1224"/>
+            <w:tcW w:type="dxa" w:w="1454"/>
             <w:vAlign w:val="center"/>
           </w:tcPr>
           <w:p>
             <w:pPr>
-              <w:spacing w:after="0"/>
+              <w:jc w:val="left"/>
             </w:pPr>
             <w:r>
               <w:rPr>
                 <w:rFonts w:ascii="Times New Roman" w:hAnsi="Times New Roman"/>
-                <w:sz w:val="14"/>
+                <w:sz w:val="12"/>
               </w:rPr>
               <w:t>public dataset</w:t>
             </w:r>
@@ -707,17 +714,17 @@
         </w:tc>
         <w:tc>
           <w:tcPr>
-            <w:tcW w:type="dxa" w:w="1296"/>
+            <w:tcW w:type="dxa" w:w="1454"/>
             <w:vAlign w:val="center"/>
           </w:tcPr>
           <w:p>
             <w:pPr>
-              <w:spacing w:after="0"/>
+              <w:jc w:val="left"/>
             </w:pPr>
             <w:r>
               <w:rPr>
                 <w:rFonts w:ascii="Times New Roman" w:hAnsi="Times New Roman"/>
-                <w:sz w:val="14"/>
+                <w:sz w:val="12"/>
               </w:rPr>
               <w:t>MANUAL CHECK REQUIRED</w:t>
             </w:r>
@@ -725,17 +732,17 @@
         </w:tc>
         <w:tc>
           <w:tcPr>
-            <w:tcW w:type="dxa" w:w="1224"/>
+            <w:tcW w:type="dxa" w:w="1454"/>
             <w:vAlign w:val="center"/>
           </w:tcPr>
           <w:p>
             <w:pPr>
-              <w:spacing w:after="0"/>
+              <w:jc w:val="left"/>
             </w:pPr>
             <w:r>
               <w:rPr>
                 <w:rFonts w:ascii="Times New Roman" w:hAnsi="Times New Roman"/>
-                <w:sz w:val="14"/>
+                <w:sz w:val="12"/>
               </w:rPr>
               <w:t>not included in lightweight package</w:t>
             </w:r>
@@ -743,17 +750,17 @@
         </w:tc>
         <w:tc>
           <w:tcPr>
-            <w:tcW w:type="dxa" w:w="864"/>
+            <w:tcW w:type="dxa" w:w="1454"/>
             <w:vAlign w:val="center"/>
           </w:tcPr>
           <w:p>
             <w:pPr>
-              <w:spacing w:after="0"/>
+              <w:jc w:val="left"/>
             </w:pPr>
             <w:r>
               <w:rPr>
                 <w:rFonts w:ascii="Times New Roman" w:hAnsi="Times New Roman"/>
-                <w:sz w:val="14"/>
+                <w:sz w:val="12"/>
               </w:rPr>
               <w:t>yes</w:t>
             </w:r>
@@ -761,17 +768,17 @@
         </w:tc>
         <w:tc>
           <w:tcPr>
-            <w:tcW w:type="dxa" w:w="3024"/>
+            <w:tcW w:type="dxa" w:w="1454"/>
             <w:vAlign w:val="center"/>
           </w:tcPr>
           <w:p>
             <w:pPr>
-              <w:spacing w:after="0"/>
+              <w:jc w:val="left"/>
             </w:pPr>
             <w:r>
               <w:rPr>
                 <w:rFonts w:ascii="Times New Roman" w:hAnsi="Times New Roman"/>
-                <w:sz w:val="14"/>
+                <w:sz w:val="12"/>
               </w:rPr>
               <w:t>Use dataset-specific terms and cite Deep Blending/3DGS dataset package; verify redistribution terms before release.</w:t>
             </w:r>
@@ -781,17 +788,17 @@
       <w:tr>
         <w:tc>
           <w:tcPr>
-            <w:tcW w:type="dxa" w:w="1224"/>
+            <w:tcW w:type="dxa" w:w="1454"/>
             <w:vAlign w:val="center"/>
           </w:tcPr>
           <w:p>
             <w:pPr>
-              <w:spacing w:after="0"/>
+              <w:jc w:val="left"/>
             </w:pPr>
             <w:r>
               <w:rPr>
                 <w:rFonts w:ascii="Times New Roman" w:hAnsi="Times New Roman"/>
-                <w:sz w:val="14"/>
+                <w:sz w:val="12"/>
               </w:rPr>
               <w:t>Deep Blending</w:t>
             </w:r>
@@ -799,17 +806,17 @@
         </w:tc>
         <w:tc>
           <w:tcPr>
-            <w:tcW w:type="dxa" w:w="1224"/>
+            <w:tcW w:type="dxa" w:w="1454"/>
             <w:vAlign w:val="center"/>
           </w:tcPr>
           <w:p>
             <w:pPr>
-              <w:spacing w:after="0"/>
+              <w:jc w:val="left"/>
             </w:pPr>
             <w:r>
               <w:rPr>
                 <w:rFonts w:ascii="Times New Roman" w:hAnsi="Times New Roman"/>
-                <w:sz w:val="14"/>
+                <w:sz w:val="12"/>
               </w:rPr>
               <w:t>db/playroom</w:t>
             </w:r>
@@ -817,17 +824,17 @@
         </w:tc>
         <w:tc>
           <w:tcPr>
-            <w:tcW w:type="dxa" w:w="936"/>
+            <w:tcW w:type="dxa" w:w="1454"/>
             <w:vAlign w:val="center"/>
           </w:tcPr>
           <w:p>
             <w:pPr>
-              <w:spacing w:after="0"/>
+              <w:jc w:val="left"/>
             </w:pPr>
             <w:r>
               <w:rPr>
                 <w:rFonts w:ascii="Times New Roman" w:hAnsi="Times New Roman"/>
-                <w:sz w:val="14"/>
+                <w:sz w:val="12"/>
               </w:rPr>
               <w:t>225</w:t>
             </w:r>
@@ -835,17 +842,17 @@
         </w:tc>
         <w:tc>
           <w:tcPr>
-            <w:tcW w:type="dxa" w:w="1080"/>
+            <w:tcW w:type="dxa" w:w="1454"/>
             <w:vAlign w:val="center"/>
           </w:tcPr>
           <w:p>
             <w:pPr>
-              <w:spacing w:after="0"/>
+              <w:jc w:val="left"/>
             </w:pPr>
             <w:r>
               <w:rPr>
                 <w:rFonts w:ascii="Times New Roman" w:hAnsi="Times New Roman"/>
-                <w:sz w:val="14"/>
+                <w:sz w:val="12"/>
               </w:rPr>
               <w:t>20</w:t>
             </w:r>
@@ -853,17 +860,17 @@
         </w:tc>
         <w:tc>
           <w:tcPr>
-            <w:tcW w:type="dxa" w:w="864"/>
+            <w:tcW w:type="dxa" w:w="1454"/>
             <w:vAlign w:val="center"/>
           </w:tcPr>
           <w:p>
             <w:pPr>
-              <w:spacing w:after="0"/>
+              <w:jc w:val="left"/>
             </w:pPr>
             <w:r>
               <w:rPr>
                 <w:rFonts w:ascii="Times New Roman" w:hAnsi="Times New Roman"/>
-                <w:sz w:val="14"/>
+                <w:sz w:val="12"/>
               </w:rPr>
               <w:t>60</w:t>
             </w:r>
@@ -871,17 +878,17 @@
         </w:tc>
         <w:tc>
           <w:tcPr>
-            <w:tcW w:type="dxa" w:w="1224"/>
+            <w:tcW w:type="dxa" w:w="1454"/>
             <w:vAlign w:val="center"/>
           </w:tcPr>
           <w:p>
             <w:pPr>
-              <w:spacing w:after="0"/>
+              <w:jc w:val="left"/>
             </w:pPr>
             <w:r>
               <w:rPr>
                 <w:rFonts w:ascii="Times New Roman" w:hAnsi="Times New Roman"/>
-                <w:sz w:val="14"/>
+                <w:sz w:val="12"/>
               </w:rPr>
               <w:t>public dataset</w:t>
             </w:r>
@@ -889,17 +896,17 @@
         </w:tc>
         <w:tc>
           <w:tcPr>
-            <w:tcW w:type="dxa" w:w="1296"/>
+            <w:tcW w:type="dxa" w:w="1454"/>
             <w:vAlign w:val="center"/>
           </w:tcPr>
           <w:p>
             <w:pPr>
-              <w:spacing w:after="0"/>
+              <w:jc w:val="left"/>
             </w:pPr>
             <w:r>
               <w:rPr>
                 <w:rFonts w:ascii="Times New Roman" w:hAnsi="Times New Roman"/>
-                <w:sz w:val="14"/>
+                <w:sz w:val="12"/>
               </w:rPr>
               <w:t>MANUAL CHECK REQUIRED</w:t>
             </w:r>
@@ -907,17 +914,17 @@
         </w:tc>
         <w:tc>
           <w:tcPr>
-            <w:tcW w:type="dxa" w:w="1224"/>
+            <w:tcW w:type="dxa" w:w="1454"/>
             <w:vAlign w:val="center"/>
           </w:tcPr>
           <w:p>
             <w:pPr>
-              <w:spacing w:after="0"/>
+              <w:jc w:val="left"/>
             </w:pPr>
             <w:r>
               <w:rPr>
                 <w:rFonts w:ascii="Times New Roman" w:hAnsi="Times New Roman"/>
-                <w:sz w:val="14"/>
+                <w:sz w:val="12"/>
               </w:rPr>
               <w:t>not included in lightweight package</w:t>
             </w:r>
@@ -925,17 +932,17 @@
         </w:tc>
         <w:tc>
           <w:tcPr>
-            <w:tcW w:type="dxa" w:w="864"/>
+            <w:tcW w:type="dxa" w:w="1454"/>
             <w:vAlign w:val="center"/>
           </w:tcPr>
           <w:p>
             <w:pPr>
-              <w:spacing w:after="0"/>
+              <w:jc w:val="left"/>
             </w:pPr>
             <w:r>
               <w:rPr>
                 <w:rFonts w:ascii="Times New Roman" w:hAnsi="Times New Roman"/>
-                <w:sz w:val="14"/>
+                <w:sz w:val="12"/>
               </w:rPr>
               <w:t>yes</w:t>
             </w:r>
@@ -943,17 +950,17 @@
         </w:tc>
         <w:tc>
           <w:tcPr>
-            <w:tcW w:type="dxa" w:w="3024"/>
+            <w:tcW w:type="dxa" w:w="1454"/>
             <w:vAlign w:val="center"/>
           </w:tcPr>
           <w:p>
             <w:pPr>
-              <w:spacing w:after="0"/>
+              <w:jc w:val="left"/>
             </w:pPr>
             <w:r>
               <w:rPr>
                 <w:rFonts w:ascii="Times New Roman" w:hAnsi="Times New Roman"/>
-                <w:sz w:val="14"/>
+                <w:sz w:val="12"/>
               </w:rPr>
               <w:t>Use dataset-specific terms and cite Deep Blending/3DGS dataset package; verify redistribution terms before release.</w:t>
             </w:r>
@@ -1334,10 +1341,6 @@
     <w:name w:val="Normal"/>
     <w:qFormat/>
     <w:rsid w:val="00FC693F"/>
-    <w:rPr>
-      <w:rFonts w:ascii="Times New Roman" w:hAnsi="Times New Roman" w:eastAsia="Times New Roman"/>
-      <w:sz w:val="16"/>
-    </w:rPr>
   </w:style>
   <w:style w:type="paragraph" w:styleId="Header">
     <w:name w:val="header"/>
@@ -1687,11 +1690,11 @@
       <w:contextualSpacing/>
     </w:pPr>
     <w:rPr>
-      <w:rFonts w:asciiTheme="majorHAnsi" w:eastAsiaTheme="majorEastAsia" w:hAnsiTheme="majorHAnsi" w:cstheme="majorBidi" w:ascii="Times New Roman" w:hAnsi="Times New Roman" w:eastAsia="Times New Roman"/>
+      <w:rFonts w:asciiTheme="majorHAnsi" w:eastAsiaTheme="majorEastAsia" w:hAnsiTheme="majorHAnsi" w:cstheme="majorBidi"/>
       <w:color w:val="17365D" w:themeColor="text2" w:themeShade="BF"/>
       <w:spacing w:val="5"/>
       <w:kern w:val="28"/>
-      <w:sz w:val="32"/>
+      <w:sz w:val="52"/>
       <w:szCs w:val="52"/>
     </w:rPr>
   </w:style>

</xml_diff>